<commit_message>
Remove the "Helpdesk" name everywhere; keep the logo only
- Header shows the logo with no wordmark
- Page/document titles, server log, sample CSV filename, temp data filename,
  package name, and the README/overview docs no longer use the name
- Regenerated README.docx and PROJECT_OVERVIEW.docx to match

Co-Authored-By: Claude Opus 4.8 <noreply@anthropic.com>
</commit_message>
<xml_diff>
--- a/PROJECT_OVERVIEW.docx
+++ b/PROJECT_OVERVIEW.docx
@@ -22,7 +22,7 @@
       </w:pPr>
       <w:r>
         <w:rPr/>
-        <w:t xml:space="preserve">Helpdesk — Internal Support Ticketing with an AI Layer</w:t>
+        <w:t xml:space="preserve">Internal Support Ticketing with an AI Layer</w:t>
       </w:r>
     </w:p>
     <w:p>
@@ -52,7 +52,7 @@
       </w:pPr>
       <w:r>
         <w:rPr/>
-        <w:t xml:space="preserve">Helpdesk is a web application through which employees can raise support tickets to internal departments — </w:t>
+        <w:t xml:space="preserve">This is a web application through which employees can raise support tickets to internal departments — </w:t>
       </w:r>
       <w:r>
         <w:rPr>

</xml_diff>